<commit_message>
Generalize DOCX redaction coverage
</commit_message>
<xml_diff>
--- a/examples/manual_test_redacted.docx
+++ b/examples/manual_test_redacted.docx
@@ -25,7 +25,10 @@
         <w:t xml:space="preserve">Full name: </w:t>
       </w:r>
       <w:r>
-        <w:t xml:space="preserve">Contact Person: </w:t>
+        <w:t>Arjun Rao</w:t>
+      </w:r>
+      <w:r>
+        <w:t xml:space="preserve">: </w:t>
       </w:r>
       <w:r>
         <w:t>Aarav Shah</w:t>
@@ -41,7 +44,10 @@
         <w:t xml:space="preserve">Titled full name: </w:t>
       </w:r>
       <w:r>
-        <w:t xml:space="preserve">Backup contact: </w:t>
+        <w:t>Maya Rao</w:t>
+      </w:r>
+      <w:r>
+        <w:t xml:space="preserve">: </w:t>
       </w:r>
       <w:r>
         <w:t>Arjun Singh</w:t>

</xml_diff>